<commit_message>
update coding, word, dan gambar
</commit_message>
<xml_diff>
--- a/Tugas 3 Kelompok.docx
+++ b/Tugas 3 Kelompok.docx
@@ -7229,7 +7229,7 @@
       <w:pPr>
         <w:pStyle w:val="ListParagraph"/>
         <w:spacing w:line="360" w:lineRule="auto"/>
-        <w:ind w:left="993"/>
+        <w:ind w:left="0"/>
         <w:rPr>
           <w:rFonts w:ascii="Times New Roman" w:hAnsi="Times New Roman" w:cs="Times New Roman"/>
           <w:b/>
@@ -7238,6 +7238,57 @@
           <w:lang w:val="en-US"/>
         </w:rPr>
       </w:pPr>
+      <w:r>
+        <w:rPr>
+          <w:rFonts w:ascii="Times New Roman" w:hAnsi="Times New Roman" w:cs="Times New Roman"/>
+          <w:b/>
+          <w:noProof/>
+          <w:sz w:val="24"/>
+          <w:szCs w:val="24"/>
+          <w:lang w:val="en-US"/>
+        </w:rPr>
+        <w:drawing>
+          <wp:inline distT="0" distB="0" distL="0" distR="0">
+            <wp:extent cx="2640965" cy="4732020"/>
+            <wp:effectExtent l="0" t="0" r="6985" b="0"/>
+            <wp:docPr id="5" name="Picture 5"/>
+            <wp:cNvGraphicFramePr>
+              <a:graphicFrameLocks xmlns:a="http://schemas.openxmlformats.org/drawingml/2006/main" noChangeAspect="1"/>
+            </wp:cNvGraphicFramePr>
+            <a:graphic xmlns:a="http://schemas.openxmlformats.org/drawingml/2006/main">
+              <a:graphicData uri="http://schemas.openxmlformats.org/drawingml/2006/picture">
+                <pic:pic xmlns:pic="http://schemas.openxmlformats.org/drawingml/2006/picture">
+                  <pic:nvPicPr>
+                    <pic:cNvPr id="5" name="flowchart.png"/>
+                    <pic:cNvPicPr/>
+                  </pic:nvPicPr>
+                  <pic:blipFill>
+                    <a:blip r:embed="rId7" cstate="print">
+                      <a:extLst>
+                        <a:ext uri="{28A0092B-C50C-407E-A947-70E740481C1C}">
+                          <a14:useLocalDpi xmlns:a14="http://schemas.microsoft.com/office/drawing/2010/main" val="0"/>
+                        </a:ext>
+                      </a:extLst>
+                    </a:blip>
+                    <a:stretch>
+                      <a:fillRect/>
+                    </a:stretch>
+                  </pic:blipFill>
+                  <pic:spPr>
+                    <a:xfrm>
+                      <a:off x="0" y="0"/>
+                      <a:ext cx="2651944" cy="4751692"/>
+                    </a:xfrm>
+                    <a:prstGeom prst="rect">
+                      <a:avLst/>
+                    </a:prstGeom>
+                  </pic:spPr>
+                </pic:pic>
+              </a:graphicData>
+            </a:graphic>
+          </wp:inline>
+        </w:drawing>
+      </w:r>
     </w:p>
     <w:p>
       <w:pPr>
@@ -7613,6 +7664,7 @@
           <w:szCs w:val="24"/>
           <w:lang w:val="en-US"/>
         </w:rPr>
+        <w:lastRenderedPageBreak/>
         <w:t>Fitur</w:t>
       </w:r>
       <w:proofErr w:type="spellEnd"/>
@@ -8508,19 +8560,6 @@
         </w:rPr>
         <w:t xml:space="preserve"> HOG.</w:t>
       </w:r>
-    </w:p>
-    <w:p>
-      <w:pPr>
-        <w:spacing w:line="360" w:lineRule="auto"/>
-        <w:ind w:left="993"/>
-        <w:jc w:val="both"/>
-        <w:rPr>
-          <w:rFonts w:ascii="Times New Roman" w:hAnsi="Times New Roman" w:cs="Times New Roman"/>
-          <w:sz w:val="24"/>
-          <w:szCs w:val="24"/>
-          <w:lang w:val="en-US"/>
-        </w:rPr>
-      </w:pPr>
     </w:p>
     <w:p>
       <w:pPr>
@@ -10380,7 +10419,7 @@
       <w:pPr>
         <w:pStyle w:val="ListParagraph"/>
         <w:spacing w:line="360" w:lineRule="auto"/>
-        <w:ind w:left="709"/>
+        <w:ind w:left="0"/>
         <w:jc w:val="both"/>
         <w:rPr>
           <w:rFonts w:ascii="Times New Roman" w:hAnsi="Times New Roman" w:cs="Times New Roman"/>
@@ -10392,14 +10431,15 @@
       <w:r>
         <w:rPr>
           <w:rFonts w:ascii="Times New Roman" w:hAnsi="Times New Roman" w:cs="Times New Roman"/>
+          <w:noProof/>
           <w:sz w:val="24"/>
           <w:szCs w:val="24"/>
           <w:lang w:val="en-US"/>
         </w:rPr>
         <w:drawing>
           <wp:inline distT="0" distB="0" distL="0" distR="0" wp14:anchorId="4DD3A747" wp14:editId="23109A03">
-            <wp:extent cx="2202180" cy="1809543"/>
-            <wp:effectExtent l="0" t="0" r="7620" b="635"/>
+            <wp:extent cx="2583180" cy="2122612"/>
+            <wp:effectExtent l="0" t="0" r="7620" b="0"/>
             <wp:docPr id="2" name="Picture 2"/>
             <wp:cNvGraphicFramePr>
               <a:graphicFrameLocks xmlns:a="http://schemas.openxmlformats.org/drawingml/2006/main" noChangeAspect="1"/>
@@ -10412,14 +10452,14 @@
                     <pic:cNvPicPr/>
                   </pic:nvPicPr>
                   <pic:blipFill rotWithShape="1">
-                    <a:blip r:embed="rId7"/>
+                    <a:blip r:embed="rId8"/>
                     <a:srcRect r="37966"/>
                     <a:stretch/>
                   </pic:blipFill>
                   <pic:spPr bwMode="auto">
                     <a:xfrm>
                       <a:off x="0" y="0"/>
-                      <a:ext cx="2217370" cy="1822025"/>
+                      <a:ext cx="2629120" cy="2160361"/>
                     </a:xfrm>
                     <a:prstGeom prst="rect">
                       <a:avLst/>
@@ -10439,14 +10479,102 @@
           </wp:inline>
         </w:drawing>
       </w:r>
-      <w:r>
-        <w:rPr>
-          <w:rFonts w:ascii="Times New Roman" w:hAnsi="Times New Roman" w:cs="Times New Roman"/>
-          <w:sz w:val="24"/>
-          <w:szCs w:val="24"/>
-          <w:lang w:val="en-US"/>
-        </w:rPr>
-        <w:t xml:space="preserve"> </w:t>
+    </w:p>
+    <w:p>
+      <w:pPr>
+        <w:pStyle w:val="ListParagraph"/>
+        <w:spacing w:line="360" w:lineRule="auto"/>
+        <w:ind w:left="0" w:firstLine="709"/>
+        <w:jc w:val="both"/>
+        <w:rPr>
+          <w:rFonts w:ascii="Times New Roman" w:hAnsi="Times New Roman" w:cs="Times New Roman"/>
+          <w:b/>
+          <w:i/>
+          <w:sz w:val="24"/>
+          <w:szCs w:val="24"/>
+          <w:lang w:val="en-US"/>
+        </w:rPr>
+      </w:pPr>
+      <w:proofErr w:type="spellStart"/>
+      <w:r>
+        <w:rPr>
+          <w:rFonts w:ascii="Times New Roman" w:hAnsi="Times New Roman" w:cs="Times New Roman"/>
+          <w:b/>
+          <w:i/>
+          <w:sz w:val="24"/>
+          <w:szCs w:val="24"/>
+          <w:lang w:val="en-US"/>
+        </w:rPr>
+        <w:t>T</w:t>
+      </w:r>
+      <w:r>
+        <w:rPr>
+          <w:rFonts w:ascii="Times New Roman" w:hAnsi="Times New Roman" w:cs="Times New Roman"/>
+          <w:b/>
+          <w:i/>
+          <w:sz w:val="24"/>
+          <w:szCs w:val="24"/>
+          <w:lang w:val="en-US"/>
+        </w:rPr>
+        <w:t>ab</w:t>
+      </w:r>
+      <w:r>
+        <w:rPr>
+          <w:rFonts w:ascii="Times New Roman" w:hAnsi="Times New Roman" w:cs="Times New Roman"/>
+          <w:b/>
+          <w:i/>
+          <w:sz w:val="24"/>
+          <w:szCs w:val="24"/>
+          <w:lang w:val="en-US"/>
+        </w:rPr>
+        <w:t>e</w:t>
+      </w:r>
+      <w:r>
+        <w:rPr>
+          <w:rFonts w:ascii="Times New Roman" w:hAnsi="Times New Roman" w:cs="Times New Roman"/>
+          <w:b/>
+          <w:i/>
+          <w:sz w:val="24"/>
+          <w:szCs w:val="24"/>
+          <w:lang w:val="en-US"/>
+        </w:rPr>
+        <w:t>l</w:t>
+      </w:r>
+      <w:proofErr w:type="spellEnd"/>
+      <w:r>
+        <w:rPr>
+          <w:rFonts w:ascii="Times New Roman" w:hAnsi="Times New Roman" w:cs="Times New Roman"/>
+          <w:b/>
+          <w:i/>
+          <w:sz w:val="24"/>
+          <w:szCs w:val="24"/>
+          <w:lang w:val="en-US"/>
+        </w:rPr>
+        <w:t xml:space="preserve"> </w:t>
+      </w:r>
+      <w:proofErr w:type="spellStart"/>
+      <w:r>
+        <w:rPr>
+          <w:rFonts w:ascii="Times New Roman" w:hAnsi="Times New Roman" w:cs="Times New Roman"/>
+          <w:b/>
+          <w:i/>
+          <w:sz w:val="24"/>
+          <w:szCs w:val="24"/>
+          <w:lang w:val="en-US"/>
+        </w:rPr>
+        <w:t>evaluasi</w:t>
+      </w:r>
+      <w:proofErr w:type="spellEnd"/>
+      <w:r>
+        <w:rPr>
+          <w:rFonts w:ascii="Times New Roman" w:hAnsi="Times New Roman" w:cs="Times New Roman"/>
+          <w:b/>
+          <w:i/>
+          <w:sz w:val="24"/>
+          <w:szCs w:val="24"/>
+          <w:lang w:val="en-US"/>
+        </w:rPr>
+        <w:t xml:space="preserve"> SVM+HOG</w:t>
       </w:r>
     </w:p>
     <w:p>
@@ -10650,6 +10778,7 @@
           <w:szCs w:val="24"/>
           <w:lang w:val="en-US"/>
         </w:rPr>
+        <w:lastRenderedPageBreak/>
         <w:t>diidentifikasi</w:t>
       </w:r>
       <w:proofErr w:type="spellEnd"/>
@@ -11505,7 +11634,7 @@
                     <pic:cNvPicPr/>
                   </pic:nvPicPr>
                   <pic:blipFill>
-                    <a:blip r:embed="rId8" cstate="print">
+                    <a:blip r:embed="rId9" cstate="print">
                       <a:extLst>
                         <a:ext uri="{28A0092B-C50C-407E-A947-70E740481C1C}">
                           <a14:useLocalDpi xmlns:a14="http://schemas.microsoft.com/office/drawing/2010/main" val="0"/>
@@ -11552,7 +11681,6 @@
           <w:szCs w:val="24"/>
           <w:lang w:val="en-US"/>
         </w:rPr>
-        <w:lastRenderedPageBreak/>
         <w:t xml:space="preserve">CNN </w:t>
       </w:r>
       <w:proofErr w:type="spellStart"/>
@@ -11985,78 +12113,198 @@
         </w:rPr>
         <w:t>mengandalkan</w:t>
       </w:r>
+      <w:proofErr w:type="spellEnd"/>
+      <w:r>
+        <w:rPr>
+          <w:rFonts w:ascii="Times New Roman" w:hAnsi="Times New Roman" w:cs="Times New Roman"/>
+          <w:sz w:val="24"/>
+          <w:szCs w:val="24"/>
+          <w:lang w:val="en-US"/>
+        </w:rPr>
+        <w:t xml:space="preserve"> </w:t>
+      </w:r>
+      <w:proofErr w:type="spellStart"/>
+      <w:r>
+        <w:rPr>
+          <w:rFonts w:ascii="Times New Roman" w:hAnsi="Times New Roman" w:cs="Times New Roman"/>
+          <w:sz w:val="24"/>
+          <w:szCs w:val="24"/>
+          <w:lang w:val="en-US"/>
+        </w:rPr>
+        <w:t>deteksi</w:t>
+      </w:r>
+      <w:proofErr w:type="spellEnd"/>
+      <w:r>
+        <w:rPr>
+          <w:rFonts w:ascii="Times New Roman" w:hAnsi="Times New Roman" w:cs="Times New Roman"/>
+          <w:sz w:val="24"/>
+          <w:szCs w:val="24"/>
+          <w:lang w:val="en-US"/>
+        </w:rPr>
+        <w:t xml:space="preserve"> </w:t>
+      </w:r>
+      <w:proofErr w:type="spellStart"/>
+      <w:r>
+        <w:rPr>
+          <w:rFonts w:ascii="Times New Roman" w:hAnsi="Times New Roman" w:cs="Times New Roman"/>
+          <w:sz w:val="24"/>
+          <w:szCs w:val="24"/>
+          <w:lang w:val="en-US"/>
+        </w:rPr>
+        <w:t>tepi</w:t>
+      </w:r>
+      <w:proofErr w:type="spellEnd"/>
+      <w:r>
+        <w:rPr>
+          <w:rFonts w:ascii="Times New Roman" w:hAnsi="Times New Roman" w:cs="Times New Roman"/>
+          <w:sz w:val="24"/>
+          <w:szCs w:val="24"/>
+          <w:lang w:val="en-US"/>
+        </w:rPr>
+        <w:t xml:space="preserve"> </w:t>
+      </w:r>
+      <w:proofErr w:type="spellStart"/>
+      <w:r>
+        <w:rPr>
+          <w:rFonts w:ascii="Times New Roman" w:hAnsi="Times New Roman" w:cs="Times New Roman"/>
+          <w:sz w:val="24"/>
+          <w:szCs w:val="24"/>
+          <w:lang w:val="en-US"/>
+        </w:rPr>
+        <w:t>konvensional</w:t>
+      </w:r>
+      <w:proofErr w:type="spellEnd"/>
+      <w:r>
+        <w:rPr>
+          <w:rFonts w:ascii="Times New Roman" w:hAnsi="Times New Roman" w:cs="Times New Roman"/>
+          <w:sz w:val="24"/>
+          <w:szCs w:val="24"/>
+          <w:lang w:val="en-US"/>
+        </w:rPr>
+        <w:t>.</w:t>
+      </w:r>
+    </w:p>
+    <w:p>
+      <w:pPr>
+        <w:spacing w:line="360" w:lineRule="auto"/>
+        <w:jc w:val="both"/>
+        <w:rPr>
+          <w:rFonts w:ascii="Times New Roman" w:hAnsi="Times New Roman" w:cs="Times New Roman"/>
+          <w:b/>
+          <w:i/>
+          <w:sz w:val="24"/>
+          <w:szCs w:val="24"/>
+          <w:lang w:val="en-US"/>
+        </w:rPr>
+      </w:pPr>
+      <w:r>
+        <w:rPr>
+          <w:rFonts w:ascii="Times New Roman" w:hAnsi="Times New Roman" w:cs="Times New Roman"/>
+          <w:sz w:val="24"/>
+          <w:szCs w:val="24"/>
+          <w:lang w:val="en-US"/>
+        </w:rPr>
+        <w:drawing>
+          <wp:inline distT="0" distB="0" distL="0" distR="0" wp14:anchorId="2FBC0968" wp14:editId="2577C063">
+            <wp:extent cx="2640965" cy="1605280"/>
+            <wp:effectExtent l="0" t="0" r="6985" b="0"/>
+            <wp:docPr id="6" name="Picture 6"/>
+            <wp:cNvGraphicFramePr>
+              <a:graphicFrameLocks xmlns:a="http://schemas.openxmlformats.org/drawingml/2006/main" noChangeAspect="1"/>
+            </wp:cNvGraphicFramePr>
+            <a:graphic xmlns:a="http://schemas.openxmlformats.org/drawingml/2006/main">
+              <a:graphicData uri="http://schemas.openxmlformats.org/drawingml/2006/picture">
+                <pic:pic xmlns:pic="http://schemas.openxmlformats.org/drawingml/2006/picture">
+                  <pic:nvPicPr>
+                    <pic:cNvPr id="1" name=""/>
+                    <pic:cNvPicPr/>
+                  </pic:nvPicPr>
+                  <pic:blipFill>
+                    <a:blip r:embed="rId10"/>
+                    <a:stretch>
+                      <a:fillRect/>
+                    </a:stretch>
+                  </pic:blipFill>
+                  <pic:spPr>
+                    <a:xfrm>
+                      <a:off x="0" y="0"/>
+                      <a:ext cx="2640965" cy="1605280"/>
+                    </a:xfrm>
+                    <a:prstGeom prst="rect">
+                      <a:avLst/>
+                    </a:prstGeom>
+                  </pic:spPr>
+                </pic:pic>
+              </a:graphicData>
+            </a:graphic>
+          </wp:inline>
+        </w:drawing>
+      </w:r>
+    </w:p>
+    <w:p>
+      <w:pPr>
+        <w:spacing w:line="360" w:lineRule="auto"/>
+        <w:ind w:firstLine="709"/>
+        <w:jc w:val="both"/>
+        <w:rPr>
+          <w:rFonts w:ascii="Times New Roman" w:hAnsi="Times New Roman" w:cs="Times New Roman"/>
+          <w:b/>
+          <w:i/>
+          <w:sz w:val="24"/>
+          <w:szCs w:val="24"/>
+          <w:lang w:val="en-US"/>
+        </w:rPr>
+      </w:pPr>
       <w:bookmarkStart w:id="0" w:name="_GoBack"/>
       <w:bookmarkEnd w:id="0"/>
-      <w:proofErr w:type="spellEnd"/>
-      <w:r>
-        <w:rPr>
-          <w:rFonts w:ascii="Times New Roman" w:hAnsi="Times New Roman" w:cs="Times New Roman"/>
-          <w:sz w:val="24"/>
-          <w:szCs w:val="24"/>
-          <w:lang w:val="en-US"/>
-        </w:rPr>
-        <w:t xml:space="preserve"> </w:t>
-      </w:r>
-      <w:proofErr w:type="spellStart"/>
-      <w:r>
-        <w:rPr>
-          <w:rFonts w:ascii="Times New Roman" w:hAnsi="Times New Roman" w:cs="Times New Roman"/>
-          <w:sz w:val="24"/>
-          <w:szCs w:val="24"/>
-          <w:lang w:val="en-US"/>
-        </w:rPr>
-        <w:t>deteksi</w:t>
-      </w:r>
-      <w:proofErr w:type="spellEnd"/>
-      <w:r>
-        <w:rPr>
-          <w:rFonts w:ascii="Times New Roman" w:hAnsi="Times New Roman" w:cs="Times New Roman"/>
-          <w:sz w:val="24"/>
-          <w:szCs w:val="24"/>
-          <w:lang w:val="en-US"/>
-        </w:rPr>
-        <w:t xml:space="preserve"> </w:t>
-      </w:r>
-      <w:proofErr w:type="spellStart"/>
-      <w:r>
-        <w:rPr>
-          <w:rFonts w:ascii="Times New Roman" w:hAnsi="Times New Roman" w:cs="Times New Roman"/>
-          <w:sz w:val="24"/>
-          <w:szCs w:val="24"/>
-          <w:lang w:val="en-US"/>
-        </w:rPr>
-        <w:t>tepi</w:t>
-      </w:r>
-      <w:proofErr w:type="spellEnd"/>
-      <w:r>
-        <w:rPr>
-          <w:rFonts w:ascii="Times New Roman" w:hAnsi="Times New Roman" w:cs="Times New Roman"/>
-          <w:sz w:val="24"/>
-          <w:szCs w:val="24"/>
-          <w:lang w:val="en-US"/>
-        </w:rPr>
-        <w:t xml:space="preserve"> </w:t>
-      </w:r>
-      <w:proofErr w:type="spellStart"/>
-      <w:r>
-        <w:rPr>
-          <w:rFonts w:ascii="Times New Roman" w:hAnsi="Times New Roman" w:cs="Times New Roman"/>
-          <w:sz w:val="24"/>
-          <w:szCs w:val="24"/>
-          <w:lang w:val="en-US"/>
-        </w:rPr>
-        <w:t>konvensional</w:t>
-      </w:r>
-      <w:proofErr w:type="spellEnd"/>
-      <w:r>
-        <w:rPr>
-          <w:rFonts w:ascii="Times New Roman" w:hAnsi="Times New Roman" w:cs="Times New Roman"/>
-          <w:sz w:val="24"/>
-          <w:szCs w:val="24"/>
-          <w:lang w:val="en-US"/>
-        </w:rPr>
-        <w:t>.</w:t>
-      </w:r>
+      <w:r>
+        <w:rPr>
+          <w:rFonts w:ascii="Times New Roman" w:hAnsi="Times New Roman" w:cs="Times New Roman"/>
+          <w:b/>
+          <w:i/>
+          <w:sz w:val="24"/>
+          <w:szCs w:val="24"/>
+          <w:lang w:val="en-US"/>
+        </w:rPr>
+        <w:t xml:space="preserve">Tabel </w:t>
+      </w:r>
+      <w:proofErr w:type="spellStart"/>
+      <w:r>
+        <w:rPr>
+          <w:rFonts w:ascii="Times New Roman" w:hAnsi="Times New Roman" w:cs="Times New Roman"/>
+          <w:b/>
+          <w:i/>
+          <w:sz w:val="24"/>
+          <w:szCs w:val="24"/>
+          <w:lang w:val="en-US"/>
+        </w:rPr>
+        <w:t>evaluasi</w:t>
+      </w:r>
+      <w:proofErr w:type="spellEnd"/>
+      <w:r>
+        <w:rPr>
+          <w:rFonts w:ascii="Times New Roman" w:hAnsi="Times New Roman" w:cs="Times New Roman"/>
+          <w:b/>
+          <w:i/>
+          <w:sz w:val="24"/>
+          <w:szCs w:val="24"/>
+          <w:lang w:val="en-US"/>
+        </w:rPr>
+        <w:t xml:space="preserve"> CNN </w:t>
+      </w:r>
+      <w:proofErr w:type="spellStart"/>
+      <w:r>
+        <w:rPr>
+          <w:rFonts w:ascii="Times New Roman" w:hAnsi="Times New Roman" w:cs="Times New Roman"/>
+          <w:b/>
+          <w:i/>
+          <w:sz w:val="24"/>
+          <w:szCs w:val="24"/>
+          <w:lang w:val="en-US"/>
+        </w:rPr>
+        <w:t>dasar</w:t>
+      </w:r>
+      <w:proofErr w:type="spellEnd"/>
     </w:p>
     <w:p>
       <w:pPr>
@@ -13399,6 +13647,7 @@
           <w:sz w:val="24"/>
           <w:szCs w:val="24"/>
         </w:rPr>
+        <w:lastRenderedPageBreak/>
         <w:t>Priambodo</w:t>
       </w:r>
       <w:proofErr w:type="spellEnd"/>
@@ -14769,6 +15018,7 @@
   <w:style w:type="character" w:default="1" w:styleId="DefaultParagraphFont">
     <w:name w:val="Default Paragraph Font"/>
     <w:uiPriority w:val="1"/>
+    <w:semiHidden/>
     <w:unhideWhenUsed/>
   </w:style>
   <w:style w:type="table" w:default="1" w:styleId="TableNormal">
@@ -15082,7 +15332,7 @@
 </file>
 
 <file path=customXml/itemProps1.xml><?xml version="1.0" encoding="utf-8"?>
-<ds:datastoreItem xmlns:ds="http://schemas.openxmlformats.org/officeDocument/2006/customXml" ds:itemID="{6F623D0E-47CE-4E8C-B874-46DEDD0B6AA7}">
+<ds:datastoreItem xmlns:ds="http://schemas.openxmlformats.org/officeDocument/2006/customXml" ds:itemID="{10E6E9B9-2A9D-42E3-8FAF-2CC930EF197E}">
   <ds:schemaRefs>
     <ds:schemaRef ds:uri="http://schemas.openxmlformats.org/officeDocument/2006/bibliography"/>
   </ds:schemaRefs>

</xml_diff>